<commit_message>
recent lab changes: 2025-11-23 22:21:00
</commit_message>
<xml_diff>
--- a/Курс 3/Архитектура ЭВМ/Лабораторные/03. Циклы/Документ Microsoft Word.docx
+++ b/Курс 3/Архитектура ЭВМ/Лабораторные/03. Циклы/Документ Microsoft Word.docx
@@ -1,6 +1,6 @@
 
 <file path=word/document.xml><?xml version="1.0" encoding="utf-8"?>
-<w:document xmlns:wpc="http://schemas.microsoft.com/office/word/2010/wordprocessingCanvas" xmlns:cx="http://schemas.microsoft.com/office/drawing/2014/chartex" xmlns:mc="http://schemas.openxmlformats.org/markup-compatibility/2006" xmlns:o="urn:schemas-microsoft-com:office:office" xmlns:r="http://schemas.openxmlformats.org/officeDocument/2006/relationships" xmlns:m="http://schemas.openxmlformats.org/officeDocument/2006/math" xmlns:v="urn:schemas-microsoft-com:vml" xmlns:wp14="http://schemas.microsoft.com/office/word/2010/wordprocessingDrawing" xmlns:wp="http://schemas.openxmlformats.org/drawingml/2006/wordprocessingDrawing" xmlns:w10="urn:schemas-microsoft-com:office:word" xmlns:w="http://schemas.openxmlformats.org/wordprocessingml/2006/main" xmlns:w14="http://schemas.microsoft.com/office/word/2010/wordml" xmlns:w15="http://schemas.microsoft.com/office/word/2012/wordml" xmlns:w16se="http://schemas.microsoft.com/office/word/2015/wordml/symex" xmlns:wpg="http://schemas.microsoft.com/office/word/2010/wordprocessingGroup" xmlns:wpi="http://schemas.microsoft.com/office/word/2010/wordprocessingInk" xmlns:wne="http://schemas.microsoft.com/office/word/2006/wordml" xmlns:wps="http://schemas.microsoft.com/office/word/2010/wordprocessingShape" mc:Ignorable="w14 w15 w16se wp14">
+<w:document xmlns:wpc="http://schemas.microsoft.com/office/word/2010/wordprocessingCanvas" xmlns:cx="http://schemas.microsoft.com/office/drawing/2014/chartex" xmlns:cx1="http://schemas.microsoft.com/office/drawing/2015/9/8/chartex" xmlns:cx2="http://schemas.microsoft.com/office/drawing/2015/10/21/chartex" xmlns:cx3="http://schemas.microsoft.com/office/drawing/2016/5/9/chartex" xmlns:cx4="http://schemas.microsoft.com/office/drawing/2016/5/10/chartex" xmlns:cx5="http://schemas.microsoft.com/office/drawing/2016/5/11/chartex" xmlns:cx6="http://schemas.microsoft.com/office/drawing/2016/5/12/chartex" xmlns:cx7="http://schemas.microsoft.com/office/drawing/2016/5/13/chartex" xmlns:cx8="http://schemas.microsoft.com/office/drawing/2016/5/14/chartex" xmlns:mc="http://schemas.openxmlformats.org/markup-compatibility/2006" xmlns:aink="http://schemas.microsoft.com/office/drawing/2016/ink" xmlns:am3d="http://schemas.microsoft.com/office/drawing/2017/model3d" xmlns:o="urn:schemas-microsoft-com:office:office" xmlns:oel="http://schemas.microsoft.com/office/2019/extlst" xmlns:r="http://schemas.openxmlformats.org/officeDocument/2006/relationships" xmlns:m="http://schemas.openxmlformats.org/officeDocument/2006/math" xmlns:v="urn:schemas-microsoft-com:vml" xmlns:wp14="http://schemas.microsoft.com/office/word/2010/wordprocessingDrawing" xmlns:wp="http://schemas.openxmlformats.org/drawingml/2006/wordprocessingDrawing" xmlns:w10="urn:schemas-microsoft-com:office:word" xmlns:w="http://schemas.openxmlformats.org/wordprocessingml/2006/main" xmlns:w14="http://schemas.microsoft.com/office/word/2010/wordml" xmlns:w15="http://schemas.microsoft.com/office/word/2012/wordml" xmlns:w16cex="http://schemas.microsoft.com/office/word/2018/wordml/cex" xmlns:w16cid="http://schemas.microsoft.com/office/word/2016/wordml/cid" xmlns:w16="http://schemas.microsoft.com/office/word/2018/wordml" xmlns:w16sdtdh="http://schemas.microsoft.com/office/word/2020/wordml/sdtdatahash" xmlns:w16se="http://schemas.microsoft.com/office/word/2015/wordml/symex" xmlns:wpg="http://schemas.microsoft.com/office/word/2010/wordprocessingGroup" xmlns:wpi="http://schemas.microsoft.com/office/word/2010/wordprocessingInk" xmlns:wne="http://schemas.microsoft.com/office/word/2006/wordml" xmlns:wps="http://schemas.microsoft.com/office/word/2010/wordprocessingShape" mc:Ignorable="w14 w15 w16se w16cid w16 w16cex w16sdtdh wp14">
   <w:body>
     <w:p>
       <w:pPr>
@@ -34,7 +34,10 @@
         <w:t>М</w:t>
       </w:r>
       <w:r>
-        <w:t>3</w:t>
+        <w:rPr>
+          <w:lang w:val="en-US"/>
+        </w:rPr>
+        <w:t>4</w:t>
       </w:r>
       <w:r>
         <w:rPr>
@@ -58,7 +61,19 @@
         <w:rPr>
           <w:lang w:val="en-US"/>
         </w:rPr>
-        <w:t xml:space="preserve">M31 – </w:t>
+        <w:t>M</w:t>
+      </w:r>
+      <w:r>
+        <w:rPr>
+          <w:lang w:val="en-US"/>
+        </w:rPr>
+        <w:t>4</w:t>
+      </w:r>
+      <w:r>
+        <w:rPr>
+          <w:lang w:val="en-US"/>
+        </w:rPr>
+        <w:t xml:space="preserve">1 – </w:t>
       </w:r>
       <w:r>
         <w:t>количество элементов</w:t>
@@ -76,7 +91,19 @@
         <w:rPr>
           <w:lang w:val="en-US"/>
         </w:rPr>
-        <w:t xml:space="preserve">M32 – </w:t>
+        <w:t>M</w:t>
+      </w:r>
+      <w:r>
+        <w:rPr>
+          <w:lang w:val="en-US"/>
+        </w:rPr>
+        <w:t>4</w:t>
+      </w:r>
+      <w:r>
+        <w:rPr>
+          <w:lang w:val="en-US"/>
+        </w:rPr>
+        <w:t xml:space="preserve">2 – </w:t>
       </w:r>
       <w:r>
         <w:t>номер итерации</w:t>
@@ -94,16 +121,25 @@
         <w:rPr>
           <w:lang w:val="en-US"/>
         </w:rPr>
-        <w:t>M33</w:t>
-      </w:r>
-      <w:r>
-        <w:t xml:space="preserve"> </w:t>
+        <w:t>M</w:t>
       </w:r>
       <w:r>
         <w:rPr>
           <w:lang w:val="en-US"/>
         </w:rPr>
-        <w:t xml:space="preserve">– 199999 </w:t>
+        <w:t>4</w:t>
+      </w:r>
+      <w:r>
+        <w:rPr>
+          <w:lang w:val="en-US"/>
+        </w:rPr>
+        <w:t>3</w:t>
+      </w:r>
+      <w:r>
+        <w:rPr>
+          <w:lang w:val="en-US"/>
+        </w:rPr>
+        <w:t xml:space="preserve"> </w:t>
       </w:r>
       <w:r>
         <w:rPr>
@@ -112,7 +148,13 @@
         <w:t xml:space="preserve">– </w:t>
       </w:r>
       <w:r>
-        <w:t>максимальное значение</w:t>
+        <w:t xml:space="preserve">максимальное </w:t>
+      </w:r>
+      <w:r>
+        <w:t xml:space="preserve">минимальное </w:t>
+      </w:r>
+      <w:r>
+        <w:t>значение</w:t>
       </w:r>
     </w:p>
     <w:p>
@@ -144,10 +186,996 @@
       <w:r>
         <w:t>массив</w:t>
       </w:r>
-      <w:bookmarkStart w:id="0" w:name="_GoBack"/>
-      <w:bookmarkEnd w:id="0"/>
     </w:p>
-    <w:p/>
+    <w:p>
+      <w:pPr>
+        <w:ind w:firstLine="0"/>
+        <w:rPr>
+          <w:lang w:val="en-US"/>
+        </w:rPr>
+      </w:pPr>
+    </w:p>
+    <w:p>
+      <w:pPr>
+        <w:ind w:firstLine="0"/>
+      </w:pPr>
+      <w:r>
+        <w:t>Код программы</w:t>
+      </w:r>
+    </w:p>
+    <w:p>
+      <w:pPr>
+        <w:ind w:firstLine="0"/>
+      </w:pPr>
+    </w:p>
+    <w:tbl>
+      <w:tblPr>
+        <w:tblStyle w:val="a4"/>
+        <w:tblW w:w="0" w:type="auto"/>
+        <w:tblLook w:val="04A0" w:firstRow="1" w:lastRow="0" w:firstColumn="1" w:lastColumn="0" w:noHBand="0" w:noVBand="1"/>
+      </w:tblPr>
+      <w:tblGrid>
+        <w:gridCol w:w="9345"/>
+      </w:tblGrid>
+      <w:tr>
+        <w:tc>
+          <w:tcPr>
+            <w:tcW w:w="9345" w:type="dxa"/>
+          </w:tcPr>
+          <w:p>
+            <w:pPr>
+              <w:ind w:firstLine="0"/>
+              <w:rPr>
+                <w:sz w:val="20"/>
+                <w:szCs w:val="20"/>
+              </w:rPr>
+            </w:pPr>
+            <w:r>
+              <w:rPr>
+                <w:sz w:val="20"/>
+                <w:szCs w:val="20"/>
+              </w:rPr>
+              <w:t>; Начальные параметры</w:t>
+            </w:r>
+          </w:p>
+          <w:p>
+            <w:pPr>
+              <w:ind w:firstLine="0"/>
+              <w:rPr>
+                <w:sz w:val="20"/>
+                <w:szCs w:val="20"/>
+              </w:rPr>
+            </w:pPr>
+            <w:r>
+              <w:rPr>
+                <w:sz w:val="20"/>
+                <w:szCs w:val="20"/>
+              </w:rPr>
+              <w:t>RD #50</w:t>
+            </w:r>
+          </w:p>
+          <w:p>
+            <w:pPr>
+              <w:ind w:firstLine="0"/>
+              <w:rPr>
+                <w:sz w:val="20"/>
+                <w:szCs w:val="20"/>
+              </w:rPr>
+            </w:pPr>
+            <w:r>
+              <w:rPr>
+                <w:sz w:val="20"/>
+                <w:szCs w:val="20"/>
+              </w:rPr>
+              <w:t>WR 40 ; Адрес массива</w:t>
+            </w:r>
+          </w:p>
+          <w:p>
+            <w:pPr>
+              <w:ind w:firstLine="0"/>
+              <w:rPr>
+                <w:sz w:val="20"/>
+                <w:szCs w:val="20"/>
+              </w:rPr>
+            </w:pPr>
+            <w:r>
+              <w:rPr>
+                <w:sz w:val="20"/>
+                <w:szCs w:val="20"/>
+              </w:rPr>
+              <w:t>IN</w:t>
+            </w:r>
+          </w:p>
+          <w:p>
+            <w:pPr>
+              <w:ind w:firstLine="0"/>
+              <w:rPr>
+                <w:sz w:val="20"/>
+                <w:szCs w:val="20"/>
+              </w:rPr>
+            </w:pPr>
+            <w:r>
+              <w:rPr>
+                <w:sz w:val="20"/>
+                <w:szCs w:val="20"/>
+              </w:rPr>
+              <w:t>WR 41 ; Кол-во элементов</w:t>
+            </w:r>
+          </w:p>
+          <w:p>
+            <w:pPr>
+              <w:ind w:firstLine="0"/>
+              <w:rPr>
+                <w:sz w:val="20"/>
+                <w:szCs w:val="20"/>
+              </w:rPr>
+            </w:pPr>
+            <w:r>
+              <w:rPr>
+                <w:sz w:val="20"/>
+                <w:szCs w:val="20"/>
+              </w:rPr>
+              <w:t>RD #0</w:t>
+            </w:r>
+          </w:p>
+          <w:p>
+            <w:pPr>
+              <w:ind w:firstLine="0"/>
+              <w:rPr>
+                <w:sz w:val="20"/>
+                <w:szCs w:val="20"/>
+              </w:rPr>
+            </w:pPr>
+            <w:r>
+              <w:rPr>
+                <w:sz w:val="20"/>
+                <w:szCs w:val="20"/>
+              </w:rPr>
+              <w:t>WR 42 ; Итерация цикла</w:t>
+            </w:r>
+          </w:p>
+          <w:p>
+            <w:pPr>
+              <w:ind w:firstLine="0"/>
+              <w:rPr>
+                <w:sz w:val="20"/>
+                <w:szCs w:val="20"/>
+              </w:rPr>
+            </w:pPr>
+          </w:p>
+          <w:p>
+            <w:pPr>
+              <w:ind w:firstLine="0"/>
+              <w:rPr>
+                <w:sz w:val="20"/>
+                <w:szCs w:val="20"/>
+              </w:rPr>
+            </w:pPr>
+            <w:r>
+              <w:rPr>
+                <w:sz w:val="20"/>
+                <w:szCs w:val="20"/>
+              </w:rPr>
+              <w:t>; Цикл инициализации максимума</w:t>
+            </w:r>
+          </w:p>
+          <w:p>
+            <w:pPr>
+              <w:ind w:firstLine="0"/>
+              <w:rPr>
+                <w:sz w:val="20"/>
+                <w:szCs w:val="20"/>
+                <w:lang w:val="en-US"/>
+              </w:rPr>
+            </w:pPr>
+            <w:r>
+              <w:rPr>
+                <w:sz w:val="20"/>
+                <w:szCs w:val="20"/>
+                <w:lang w:val="en-US"/>
+              </w:rPr>
+              <w:t>I:  RD @40</w:t>
+            </w:r>
+          </w:p>
+          <w:p>
+            <w:pPr>
+              <w:ind w:firstLine="0"/>
+              <w:rPr>
+                <w:sz w:val="20"/>
+                <w:szCs w:val="20"/>
+                <w:lang w:val="en-US"/>
+              </w:rPr>
+            </w:pPr>
+            <w:r>
+              <w:rPr>
+                <w:sz w:val="20"/>
+                <w:szCs w:val="20"/>
+                <w:lang w:val="en-US"/>
+              </w:rPr>
+              <w:t xml:space="preserve">    JNS NI</w:t>
+            </w:r>
+          </w:p>
+          <w:p>
+            <w:pPr>
+              <w:ind w:firstLine="0"/>
+              <w:rPr>
+                <w:sz w:val="20"/>
+                <w:szCs w:val="20"/>
+                <w:lang w:val="en-US"/>
+              </w:rPr>
+            </w:pPr>
+            <w:r>
+              <w:rPr>
+                <w:sz w:val="20"/>
+                <w:szCs w:val="20"/>
+                <w:lang w:val="en-US"/>
+              </w:rPr>
+              <w:t xml:space="preserve">    RD @40</w:t>
+            </w:r>
+          </w:p>
+          <w:p>
+            <w:pPr>
+              <w:ind w:firstLine="0"/>
+              <w:rPr>
+                <w:sz w:val="20"/>
+                <w:szCs w:val="20"/>
+              </w:rPr>
+            </w:pPr>
+            <w:r>
+              <w:rPr>
+                <w:sz w:val="20"/>
+                <w:szCs w:val="20"/>
+                <w:lang w:val="en-US"/>
+              </w:rPr>
+              <w:t xml:space="preserve">    </w:t>
+            </w:r>
+            <w:r>
+              <w:rPr>
+                <w:sz w:val="20"/>
+                <w:szCs w:val="20"/>
+              </w:rPr>
+              <w:t>WR 43</w:t>
+            </w:r>
+          </w:p>
+          <w:p>
+            <w:pPr>
+              <w:ind w:firstLine="0"/>
+              <w:rPr>
+                <w:sz w:val="20"/>
+                <w:szCs w:val="20"/>
+              </w:rPr>
+            </w:pPr>
+            <w:r>
+              <w:rPr>
+                <w:sz w:val="20"/>
+                <w:szCs w:val="20"/>
+              </w:rPr>
+              <w:t xml:space="preserve">    JMP A</w:t>
+            </w:r>
+          </w:p>
+          <w:p>
+            <w:pPr>
+              <w:ind w:firstLine="0"/>
+              <w:rPr>
+                <w:sz w:val="20"/>
+                <w:szCs w:val="20"/>
+              </w:rPr>
+            </w:pPr>
+          </w:p>
+          <w:p>
+            <w:pPr>
+              <w:ind w:firstLine="0"/>
+              <w:rPr>
+                <w:sz w:val="20"/>
+                <w:szCs w:val="20"/>
+              </w:rPr>
+            </w:pPr>
+            <w:r>
+              <w:rPr>
+                <w:sz w:val="20"/>
+                <w:szCs w:val="20"/>
+              </w:rPr>
+              <w:t xml:space="preserve">    ; Переход на следующий элемент</w:t>
+            </w:r>
+          </w:p>
+          <w:p>
+            <w:pPr>
+              <w:ind w:firstLine="0"/>
+              <w:rPr>
+                <w:sz w:val="20"/>
+                <w:szCs w:val="20"/>
+              </w:rPr>
+            </w:pPr>
+            <w:r>
+              <w:rPr>
+                <w:sz w:val="20"/>
+                <w:szCs w:val="20"/>
+              </w:rPr>
+              <w:t xml:space="preserve">    NI: RD 40</w:t>
+            </w:r>
+          </w:p>
+          <w:p>
+            <w:pPr>
+              <w:ind w:firstLine="0"/>
+              <w:rPr>
+                <w:sz w:val="20"/>
+                <w:szCs w:val="20"/>
+              </w:rPr>
+            </w:pPr>
+            <w:r>
+              <w:rPr>
+                <w:sz w:val="20"/>
+                <w:szCs w:val="20"/>
+              </w:rPr>
+              <w:t xml:space="preserve">         ADD #1</w:t>
+            </w:r>
+          </w:p>
+          <w:p>
+            <w:pPr>
+              <w:ind w:firstLine="0"/>
+              <w:rPr>
+                <w:sz w:val="20"/>
+                <w:szCs w:val="20"/>
+              </w:rPr>
+            </w:pPr>
+            <w:r>
+              <w:rPr>
+                <w:sz w:val="20"/>
+                <w:szCs w:val="20"/>
+              </w:rPr>
+              <w:t xml:space="preserve">         WR 40</w:t>
+            </w:r>
+          </w:p>
+          <w:p>
+            <w:pPr>
+              <w:ind w:firstLine="0"/>
+              <w:rPr>
+                <w:sz w:val="20"/>
+                <w:szCs w:val="20"/>
+              </w:rPr>
+            </w:pPr>
+            <w:r>
+              <w:rPr>
+                <w:sz w:val="20"/>
+                <w:szCs w:val="20"/>
+              </w:rPr>
+              <w:t xml:space="preserve">         ; Увеличение итерации</w:t>
+            </w:r>
+          </w:p>
+          <w:p>
+            <w:pPr>
+              <w:ind w:firstLine="0"/>
+              <w:rPr>
+                <w:sz w:val="20"/>
+                <w:szCs w:val="20"/>
+              </w:rPr>
+            </w:pPr>
+            <w:r>
+              <w:rPr>
+                <w:sz w:val="20"/>
+                <w:szCs w:val="20"/>
+              </w:rPr>
+              <w:t xml:space="preserve">         RD 42</w:t>
+            </w:r>
+          </w:p>
+          <w:p>
+            <w:pPr>
+              <w:ind w:firstLine="0"/>
+              <w:rPr>
+                <w:sz w:val="20"/>
+                <w:szCs w:val="20"/>
+              </w:rPr>
+            </w:pPr>
+            <w:r>
+              <w:rPr>
+                <w:sz w:val="20"/>
+                <w:szCs w:val="20"/>
+              </w:rPr>
+              <w:t xml:space="preserve">         ADD #1</w:t>
+            </w:r>
+          </w:p>
+          <w:p>
+            <w:pPr>
+              <w:ind w:firstLine="0"/>
+              <w:rPr>
+                <w:sz w:val="20"/>
+                <w:szCs w:val="20"/>
+              </w:rPr>
+            </w:pPr>
+            <w:r>
+              <w:rPr>
+                <w:sz w:val="20"/>
+                <w:szCs w:val="20"/>
+              </w:rPr>
+              <w:t xml:space="preserve">         WR 42</w:t>
+            </w:r>
+          </w:p>
+          <w:p>
+            <w:pPr>
+              <w:ind w:firstLine="0"/>
+              <w:rPr>
+                <w:sz w:val="20"/>
+                <w:szCs w:val="20"/>
+              </w:rPr>
+            </w:pPr>
+          </w:p>
+          <w:p>
+            <w:pPr>
+              <w:ind w:firstLine="0"/>
+              <w:rPr>
+                <w:sz w:val="20"/>
+                <w:szCs w:val="20"/>
+              </w:rPr>
+            </w:pPr>
+            <w:r>
+              <w:rPr>
+                <w:sz w:val="20"/>
+                <w:szCs w:val="20"/>
+              </w:rPr>
+              <w:t xml:space="preserve">    ; Проверка итерации цикла</w:t>
+            </w:r>
+          </w:p>
+          <w:p>
+            <w:pPr>
+              <w:ind w:firstLine="0"/>
+              <w:rPr>
+                <w:sz w:val="20"/>
+                <w:szCs w:val="20"/>
+                <w:lang w:val="en-US"/>
+              </w:rPr>
+            </w:pPr>
+            <w:r>
+              <w:rPr>
+                <w:sz w:val="20"/>
+                <w:szCs w:val="20"/>
+              </w:rPr>
+              <w:t xml:space="preserve">    </w:t>
+            </w:r>
+            <w:r>
+              <w:rPr>
+                <w:sz w:val="20"/>
+                <w:szCs w:val="20"/>
+                <w:lang w:val="en-US"/>
+              </w:rPr>
+              <w:t>RD 42</w:t>
+            </w:r>
+          </w:p>
+          <w:p>
+            <w:pPr>
+              <w:ind w:firstLine="0"/>
+              <w:rPr>
+                <w:sz w:val="20"/>
+                <w:szCs w:val="20"/>
+                <w:lang w:val="en-US"/>
+              </w:rPr>
+            </w:pPr>
+            <w:r>
+              <w:rPr>
+                <w:sz w:val="20"/>
+                <w:szCs w:val="20"/>
+                <w:lang w:val="en-US"/>
+              </w:rPr>
+              <w:t xml:space="preserve">    SUB 41</w:t>
+            </w:r>
+          </w:p>
+          <w:p>
+            <w:pPr>
+              <w:ind w:firstLine="0"/>
+              <w:rPr>
+                <w:sz w:val="20"/>
+                <w:szCs w:val="20"/>
+                <w:lang w:val="en-US"/>
+              </w:rPr>
+            </w:pPr>
+            <w:r>
+              <w:rPr>
+                <w:sz w:val="20"/>
+                <w:szCs w:val="20"/>
+                <w:lang w:val="en-US"/>
+              </w:rPr>
+              <w:t xml:space="preserve">    JS I</w:t>
+            </w:r>
+          </w:p>
+          <w:p>
+            <w:pPr>
+              <w:ind w:firstLine="0"/>
+              <w:rPr>
+                <w:sz w:val="20"/>
+                <w:szCs w:val="20"/>
+                <w:lang w:val="en-US"/>
+              </w:rPr>
+            </w:pPr>
+          </w:p>
+          <w:p>
+            <w:pPr>
+              <w:ind w:firstLine="0"/>
+              <w:rPr>
+                <w:sz w:val="20"/>
+                <w:szCs w:val="20"/>
+                <w:lang w:val="en-US"/>
+              </w:rPr>
+            </w:pPr>
+            <w:r>
+              <w:rPr>
+                <w:sz w:val="20"/>
+                <w:szCs w:val="20"/>
+                <w:lang w:val="en-US"/>
+              </w:rPr>
+              <w:t>A: RD #0</w:t>
+            </w:r>
+          </w:p>
+          <w:p>
+            <w:pPr>
+              <w:ind w:firstLine="0"/>
+              <w:rPr>
+                <w:sz w:val="20"/>
+                <w:szCs w:val="20"/>
+              </w:rPr>
+            </w:pPr>
+            <w:r>
+              <w:rPr>
+                <w:sz w:val="20"/>
+                <w:szCs w:val="20"/>
+              </w:rPr>
+              <w:t>WR 42</w:t>
+            </w:r>
+          </w:p>
+          <w:p>
+            <w:pPr>
+              <w:ind w:firstLine="0"/>
+              <w:rPr>
+                <w:sz w:val="20"/>
+                <w:szCs w:val="20"/>
+              </w:rPr>
+            </w:pPr>
+          </w:p>
+          <w:p>
+            <w:pPr>
+              <w:ind w:firstLine="0"/>
+              <w:rPr>
+                <w:sz w:val="20"/>
+                <w:szCs w:val="20"/>
+              </w:rPr>
+            </w:pPr>
+            <w:r>
+              <w:rPr>
+                <w:sz w:val="20"/>
+                <w:szCs w:val="20"/>
+              </w:rPr>
+              <w:t>; Цикл поиска максимума</w:t>
+            </w:r>
+          </w:p>
+          <w:p>
+            <w:pPr>
+              <w:ind w:firstLine="0"/>
+              <w:rPr>
+                <w:sz w:val="20"/>
+                <w:szCs w:val="20"/>
+              </w:rPr>
+            </w:pPr>
+            <w:r>
+              <w:rPr>
+                <w:sz w:val="20"/>
+                <w:szCs w:val="20"/>
+              </w:rPr>
+              <w:t>L:  RD @40</w:t>
+            </w:r>
+          </w:p>
+          <w:p>
+            <w:pPr>
+              <w:ind w:firstLine="0"/>
+              <w:rPr>
+                <w:sz w:val="20"/>
+                <w:szCs w:val="20"/>
+                <w:lang w:val="en-US"/>
+              </w:rPr>
+            </w:pPr>
+            <w:r>
+              <w:rPr>
+                <w:sz w:val="20"/>
+                <w:szCs w:val="20"/>
+              </w:rPr>
+              <w:t xml:space="preserve">    </w:t>
+            </w:r>
+            <w:r>
+              <w:rPr>
+                <w:sz w:val="20"/>
+                <w:szCs w:val="20"/>
+                <w:lang w:val="en-US"/>
+              </w:rPr>
+              <w:t>JNS N</w:t>
+            </w:r>
+          </w:p>
+          <w:p>
+            <w:pPr>
+              <w:ind w:firstLine="0"/>
+              <w:rPr>
+                <w:sz w:val="20"/>
+                <w:szCs w:val="20"/>
+                <w:lang w:val="en-US"/>
+              </w:rPr>
+            </w:pPr>
+            <w:r>
+              <w:rPr>
+                <w:sz w:val="20"/>
+                <w:szCs w:val="20"/>
+                <w:lang w:val="en-US"/>
+              </w:rPr>
+              <w:t xml:space="preserve">    SUB 43</w:t>
+            </w:r>
+          </w:p>
+          <w:p>
+            <w:pPr>
+              <w:ind w:firstLine="0"/>
+              <w:rPr>
+                <w:sz w:val="20"/>
+                <w:szCs w:val="20"/>
+                <w:lang w:val="en-US"/>
+              </w:rPr>
+            </w:pPr>
+            <w:r>
+              <w:rPr>
+                <w:sz w:val="20"/>
+                <w:szCs w:val="20"/>
+                <w:lang w:val="en-US"/>
+              </w:rPr>
+              <w:t xml:space="preserve">    JS N</w:t>
+            </w:r>
+          </w:p>
+          <w:p>
+            <w:pPr>
+              <w:ind w:firstLine="0"/>
+              <w:rPr>
+                <w:sz w:val="20"/>
+                <w:szCs w:val="20"/>
+                <w:lang w:val="en-US"/>
+              </w:rPr>
+            </w:pPr>
+            <w:r>
+              <w:rPr>
+                <w:sz w:val="20"/>
+                <w:szCs w:val="20"/>
+                <w:lang w:val="en-US"/>
+              </w:rPr>
+              <w:t xml:space="preserve">    RD @40</w:t>
+            </w:r>
+          </w:p>
+          <w:p>
+            <w:pPr>
+              <w:ind w:firstLine="0"/>
+              <w:rPr>
+                <w:sz w:val="20"/>
+                <w:szCs w:val="20"/>
+              </w:rPr>
+            </w:pPr>
+            <w:r>
+              <w:rPr>
+                <w:sz w:val="20"/>
+                <w:szCs w:val="20"/>
+                <w:lang w:val="en-US"/>
+              </w:rPr>
+              <w:t xml:space="preserve">    </w:t>
+            </w:r>
+            <w:r>
+              <w:rPr>
+                <w:sz w:val="20"/>
+                <w:szCs w:val="20"/>
+              </w:rPr>
+              <w:t>WR 43</w:t>
+            </w:r>
+          </w:p>
+          <w:p>
+            <w:pPr>
+              <w:ind w:firstLine="0"/>
+              <w:rPr>
+                <w:sz w:val="20"/>
+                <w:szCs w:val="20"/>
+              </w:rPr>
+            </w:pPr>
+          </w:p>
+          <w:p>
+            <w:pPr>
+              <w:ind w:firstLine="0"/>
+              <w:rPr>
+                <w:sz w:val="20"/>
+                <w:szCs w:val="20"/>
+              </w:rPr>
+            </w:pPr>
+            <w:r>
+              <w:rPr>
+                <w:sz w:val="20"/>
+                <w:szCs w:val="20"/>
+              </w:rPr>
+              <w:t xml:space="preserve">    ; Переход на следующий элемент</w:t>
+            </w:r>
+          </w:p>
+          <w:p>
+            <w:pPr>
+              <w:ind w:firstLine="0"/>
+              <w:rPr>
+                <w:sz w:val="20"/>
+                <w:szCs w:val="20"/>
+              </w:rPr>
+            </w:pPr>
+            <w:r>
+              <w:rPr>
+                <w:sz w:val="20"/>
+                <w:szCs w:val="20"/>
+              </w:rPr>
+              <w:t xml:space="preserve">    N: RD 40</w:t>
+            </w:r>
+          </w:p>
+          <w:p>
+            <w:pPr>
+              <w:ind w:firstLine="0"/>
+              <w:rPr>
+                <w:sz w:val="20"/>
+                <w:szCs w:val="20"/>
+              </w:rPr>
+            </w:pPr>
+            <w:r>
+              <w:rPr>
+                <w:sz w:val="20"/>
+                <w:szCs w:val="20"/>
+              </w:rPr>
+              <w:t xml:space="preserve">         ADD #1</w:t>
+            </w:r>
+          </w:p>
+          <w:p>
+            <w:pPr>
+              <w:ind w:firstLine="0"/>
+              <w:rPr>
+                <w:sz w:val="20"/>
+                <w:szCs w:val="20"/>
+              </w:rPr>
+            </w:pPr>
+            <w:r>
+              <w:rPr>
+                <w:sz w:val="20"/>
+                <w:szCs w:val="20"/>
+              </w:rPr>
+              <w:t xml:space="preserve">         WR 40</w:t>
+            </w:r>
+          </w:p>
+          <w:p>
+            <w:pPr>
+              <w:ind w:firstLine="0"/>
+              <w:rPr>
+                <w:sz w:val="20"/>
+                <w:szCs w:val="20"/>
+              </w:rPr>
+            </w:pPr>
+            <w:r>
+              <w:rPr>
+                <w:sz w:val="20"/>
+                <w:szCs w:val="20"/>
+              </w:rPr>
+              <w:t xml:space="preserve">         ; Увеличение итерации</w:t>
+            </w:r>
+          </w:p>
+          <w:p>
+            <w:pPr>
+              <w:ind w:firstLine="0"/>
+              <w:rPr>
+                <w:sz w:val="20"/>
+                <w:szCs w:val="20"/>
+              </w:rPr>
+            </w:pPr>
+            <w:r>
+              <w:rPr>
+                <w:sz w:val="20"/>
+                <w:szCs w:val="20"/>
+              </w:rPr>
+              <w:t xml:space="preserve">         RD 42</w:t>
+            </w:r>
+          </w:p>
+          <w:p>
+            <w:pPr>
+              <w:ind w:firstLine="0"/>
+              <w:rPr>
+                <w:sz w:val="20"/>
+                <w:szCs w:val="20"/>
+              </w:rPr>
+            </w:pPr>
+            <w:r>
+              <w:rPr>
+                <w:sz w:val="20"/>
+                <w:szCs w:val="20"/>
+              </w:rPr>
+              <w:t xml:space="preserve">         ADD #1</w:t>
+            </w:r>
+          </w:p>
+          <w:p>
+            <w:pPr>
+              <w:ind w:firstLine="0"/>
+              <w:rPr>
+                <w:sz w:val="20"/>
+                <w:szCs w:val="20"/>
+              </w:rPr>
+            </w:pPr>
+            <w:r>
+              <w:rPr>
+                <w:sz w:val="20"/>
+                <w:szCs w:val="20"/>
+              </w:rPr>
+              <w:t xml:space="preserve">         WR 42</w:t>
+            </w:r>
+          </w:p>
+          <w:p>
+            <w:pPr>
+              <w:ind w:firstLine="0"/>
+              <w:rPr>
+                <w:sz w:val="20"/>
+                <w:szCs w:val="20"/>
+              </w:rPr>
+            </w:pPr>
+          </w:p>
+          <w:p>
+            <w:pPr>
+              <w:ind w:firstLine="0"/>
+              <w:rPr>
+                <w:sz w:val="20"/>
+                <w:szCs w:val="20"/>
+              </w:rPr>
+            </w:pPr>
+            <w:r>
+              <w:rPr>
+                <w:sz w:val="20"/>
+                <w:szCs w:val="20"/>
+              </w:rPr>
+              <w:t xml:space="preserve">    ; Проверка итерации цикла</w:t>
+            </w:r>
+          </w:p>
+          <w:p>
+            <w:pPr>
+              <w:ind w:firstLine="0"/>
+              <w:rPr>
+                <w:sz w:val="20"/>
+                <w:szCs w:val="20"/>
+              </w:rPr>
+            </w:pPr>
+            <w:r>
+              <w:rPr>
+                <w:sz w:val="20"/>
+                <w:szCs w:val="20"/>
+              </w:rPr>
+              <w:t xml:space="preserve">    RD 42</w:t>
+            </w:r>
+          </w:p>
+          <w:p>
+            <w:pPr>
+              <w:ind w:firstLine="0"/>
+              <w:rPr>
+                <w:sz w:val="20"/>
+                <w:szCs w:val="20"/>
+              </w:rPr>
+            </w:pPr>
+            <w:r>
+              <w:rPr>
+                <w:sz w:val="20"/>
+                <w:szCs w:val="20"/>
+              </w:rPr>
+              <w:t xml:space="preserve">    SUB 41</w:t>
+            </w:r>
+          </w:p>
+          <w:p>
+            <w:pPr>
+              <w:ind w:firstLine="0"/>
+              <w:rPr>
+                <w:sz w:val="20"/>
+                <w:szCs w:val="20"/>
+              </w:rPr>
+            </w:pPr>
+            <w:r>
+              <w:rPr>
+                <w:sz w:val="20"/>
+                <w:szCs w:val="20"/>
+              </w:rPr>
+              <w:t xml:space="preserve">    JS L</w:t>
+            </w:r>
+          </w:p>
+          <w:p>
+            <w:pPr>
+              <w:ind w:firstLine="0"/>
+              <w:rPr>
+                <w:sz w:val="20"/>
+                <w:szCs w:val="20"/>
+              </w:rPr>
+            </w:pPr>
+          </w:p>
+          <w:p>
+            <w:pPr>
+              <w:ind w:firstLine="0"/>
+              <w:rPr>
+                <w:sz w:val="20"/>
+                <w:szCs w:val="20"/>
+              </w:rPr>
+            </w:pPr>
+            <w:r>
+              <w:rPr>
+                <w:sz w:val="20"/>
+                <w:szCs w:val="20"/>
+              </w:rPr>
+              <w:t>; Чтение результата</w:t>
+            </w:r>
+          </w:p>
+          <w:p>
+            <w:pPr>
+              <w:ind w:firstLine="0"/>
+              <w:rPr>
+                <w:sz w:val="20"/>
+                <w:szCs w:val="20"/>
+              </w:rPr>
+            </w:pPr>
+            <w:r>
+              <w:rPr>
+                <w:sz w:val="20"/>
+                <w:szCs w:val="20"/>
+              </w:rPr>
+              <w:t>RD 43</w:t>
+            </w:r>
+          </w:p>
+          <w:p>
+            <w:pPr>
+              <w:ind w:firstLine="0"/>
+              <w:rPr>
+                <w:sz w:val="20"/>
+                <w:szCs w:val="20"/>
+              </w:rPr>
+            </w:pPr>
+          </w:p>
+          <w:p>
+            <w:pPr>
+              <w:ind w:firstLine="0"/>
+              <w:rPr>
+                <w:sz w:val="20"/>
+                <w:szCs w:val="20"/>
+              </w:rPr>
+            </w:pPr>
+            <w:r>
+              <w:rPr>
+                <w:sz w:val="20"/>
+                <w:szCs w:val="20"/>
+              </w:rPr>
+              <w:t>; Завершение работы</w:t>
+            </w:r>
+          </w:p>
+          <w:p>
+            <w:pPr>
+              <w:ind w:firstLine="0"/>
+              <w:rPr>
+                <w:sz w:val="20"/>
+                <w:szCs w:val="20"/>
+              </w:rPr>
+            </w:pPr>
+            <w:r>
+              <w:rPr>
+                <w:sz w:val="20"/>
+                <w:szCs w:val="20"/>
+              </w:rPr>
+              <w:t>E: OUT</w:t>
+            </w:r>
+          </w:p>
+          <w:p>
+            <w:pPr>
+              <w:ind w:firstLine="0"/>
+            </w:pPr>
+            <w:r>
+              <w:rPr>
+                <w:sz w:val="20"/>
+                <w:szCs w:val="20"/>
+              </w:rPr>
+              <w:t xml:space="preserve">   HLT</w:t>
+            </w:r>
+          </w:p>
+        </w:tc>
+      </w:tr>
+    </w:tbl>
+    <w:p>
+      <w:pPr>
+        <w:ind w:firstLine="0"/>
+      </w:pPr>
+    </w:p>
     <w:sectPr>
       <w:pgSz w:w="11906" w:h="16838"/>
       <w:pgMar w:top="1134" w:right="850" w:bottom="1134" w:left="1701" w:header="708" w:footer="708" w:gutter="0"/>
@@ -159,7 +1187,7 @@
 </file>
 
 <file path=word/numbering.xml><?xml version="1.0" encoding="utf-8"?>
-<w:numbering xmlns:wpc="http://schemas.microsoft.com/office/word/2010/wordprocessingCanvas" xmlns:cx="http://schemas.microsoft.com/office/drawing/2014/chartex" xmlns:mc="http://schemas.openxmlformats.org/markup-compatibility/2006" xmlns:o="urn:schemas-microsoft-com:office:office" xmlns:r="http://schemas.openxmlformats.org/officeDocument/2006/relationships" xmlns:m="http://schemas.openxmlformats.org/officeDocument/2006/math" xmlns:v="urn:schemas-microsoft-com:vml" xmlns:wp14="http://schemas.microsoft.com/office/word/2010/wordprocessingDrawing" xmlns:wp="http://schemas.openxmlformats.org/drawingml/2006/wordprocessingDrawing" xmlns:w10="urn:schemas-microsoft-com:office:word" xmlns:w="http://schemas.openxmlformats.org/wordprocessingml/2006/main" xmlns:w14="http://schemas.microsoft.com/office/word/2010/wordml" xmlns:w15="http://schemas.microsoft.com/office/word/2012/wordml" xmlns:w16se="http://schemas.microsoft.com/office/word/2015/wordml/symex" xmlns:wpg="http://schemas.microsoft.com/office/word/2010/wordprocessingGroup" xmlns:wpi="http://schemas.microsoft.com/office/word/2010/wordprocessingInk" xmlns:wne="http://schemas.microsoft.com/office/word/2006/wordml" xmlns:wps="http://schemas.microsoft.com/office/word/2010/wordprocessingShape" mc:Ignorable="w14 w15 w16se wp14">
+<w:numbering xmlns:wpc="http://schemas.microsoft.com/office/word/2010/wordprocessingCanvas" xmlns:cx="http://schemas.microsoft.com/office/drawing/2014/chartex" xmlns:cx1="http://schemas.microsoft.com/office/drawing/2015/9/8/chartex" xmlns:cx2="http://schemas.microsoft.com/office/drawing/2015/10/21/chartex" xmlns:cx3="http://schemas.microsoft.com/office/drawing/2016/5/9/chartex" xmlns:cx4="http://schemas.microsoft.com/office/drawing/2016/5/10/chartex" xmlns:cx5="http://schemas.microsoft.com/office/drawing/2016/5/11/chartex" xmlns:cx6="http://schemas.microsoft.com/office/drawing/2016/5/12/chartex" xmlns:cx7="http://schemas.microsoft.com/office/drawing/2016/5/13/chartex" xmlns:cx8="http://schemas.microsoft.com/office/drawing/2016/5/14/chartex" xmlns:mc="http://schemas.openxmlformats.org/markup-compatibility/2006" xmlns:aink="http://schemas.microsoft.com/office/drawing/2016/ink" xmlns:am3d="http://schemas.microsoft.com/office/drawing/2017/model3d" xmlns:o="urn:schemas-microsoft-com:office:office" xmlns:oel="http://schemas.microsoft.com/office/2019/extlst" xmlns:r="http://schemas.openxmlformats.org/officeDocument/2006/relationships" xmlns:m="http://schemas.openxmlformats.org/officeDocument/2006/math" xmlns:v="urn:schemas-microsoft-com:vml" xmlns:wp14="http://schemas.microsoft.com/office/word/2010/wordprocessingDrawing" xmlns:wp="http://schemas.openxmlformats.org/drawingml/2006/wordprocessingDrawing" xmlns:w10="urn:schemas-microsoft-com:office:word" xmlns:w="http://schemas.openxmlformats.org/wordprocessingml/2006/main" xmlns:w14="http://schemas.microsoft.com/office/word/2010/wordml" xmlns:w15="http://schemas.microsoft.com/office/word/2012/wordml" xmlns:w16cex="http://schemas.microsoft.com/office/word/2018/wordml/cex" xmlns:w16cid="http://schemas.microsoft.com/office/word/2016/wordml/cid" xmlns:w16="http://schemas.microsoft.com/office/word/2018/wordml" xmlns:w16sdtdh="http://schemas.microsoft.com/office/word/2020/wordml/sdtdatahash" xmlns:w16se="http://schemas.microsoft.com/office/word/2015/wordml/symex" xmlns:wpg="http://schemas.microsoft.com/office/word/2010/wordprocessingGroup" xmlns:wpi="http://schemas.microsoft.com/office/word/2010/wordprocessingInk" xmlns:wne="http://schemas.microsoft.com/office/word/2006/wordml" xmlns:wps="http://schemas.microsoft.com/office/word/2010/wordprocessingShape" mc:Ignorable="w14 w15 w16se w16cid w16 w16cex w16sdtdh wp14">
   <w:abstractNum w:abstractNumId="0" w15:restartNumberingAfterBreak="0">
     <w:nsid w:val="4F56591C"/>
     <w:multiLevelType w:val="hybridMultilevel"/>
@@ -273,14 +1301,14 @@
       </w:rPr>
     </w:lvl>
   </w:abstractNum>
-  <w:num w:numId="1">
+  <w:num w:numId="1" w16cid:durableId="1474133520">
     <w:abstractNumId w:val="0"/>
   </w:num>
 </w:numbering>
 </file>
 
 <file path=word/styles.xml><?xml version="1.0" encoding="utf-8"?>
-<w:styles xmlns:mc="http://schemas.openxmlformats.org/markup-compatibility/2006" xmlns:r="http://schemas.openxmlformats.org/officeDocument/2006/relationships" xmlns:w="http://schemas.openxmlformats.org/wordprocessingml/2006/main" xmlns:w14="http://schemas.microsoft.com/office/word/2010/wordml" xmlns:w15="http://schemas.microsoft.com/office/word/2012/wordml" xmlns:w16se="http://schemas.microsoft.com/office/word/2015/wordml/symex" mc:Ignorable="w14 w15 w16se">
+<w:styles xmlns:mc="http://schemas.openxmlformats.org/markup-compatibility/2006" xmlns:r="http://schemas.openxmlformats.org/officeDocument/2006/relationships" xmlns:w="http://schemas.openxmlformats.org/wordprocessingml/2006/main" xmlns:w14="http://schemas.microsoft.com/office/word/2010/wordml" xmlns:w15="http://schemas.microsoft.com/office/word/2012/wordml" xmlns:w16cex="http://schemas.microsoft.com/office/word/2018/wordml/cex" xmlns:w16cid="http://schemas.microsoft.com/office/word/2016/wordml/cid" xmlns:w16="http://schemas.microsoft.com/office/word/2018/wordml" xmlns:w16sdtdh="http://schemas.microsoft.com/office/word/2020/wordml/sdtdatahash" xmlns:w16se="http://schemas.microsoft.com/office/word/2015/wordml/symex" mc:Ignorable="w14 w15 w16se w16cid w16 w16cex w16sdtdh">
   <w:docDefaults>
     <w:rPrDefault>
       <w:rPr>
@@ -296,7 +1324,7 @@
       </w:pPr>
     </w:pPrDefault>
   </w:docDefaults>
-  <w:latentStyles w:defLockedState="0" w:defUIPriority="99" w:defSemiHidden="0" w:defUnhideWhenUsed="0" w:defQFormat="0" w:count="371">
+  <w:latentStyles w:defLockedState="0" w:defUIPriority="99" w:defSemiHidden="0" w:defUnhideWhenUsed="0" w:defQFormat="0" w:count="376">
     <w:lsdException w:name="Normal" w:uiPriority="0" w:qFormat="1"/>
     <w:lsdException w:name="heading 1" w:uiPriority="9" w:qFormat="1"/>
     <w:lsdException w:name="heading 2" w:semiHidden="1" w:uiPriority="9" w:unhideWhenUsed="1" w:qFormat="1"/>
@@ -668,6 +1696,11 @@
     <w:lsdException w:name="List Table 5 Dark Accent 6" w:uiPriority="50"/>
     <w:lsdException w:name="List Table 6 Colorful Accent 6" w:uiPriority="51"/>
     <w:lsdException w:name="List Table 7 Colorful Accent 6" w:uiPriority="52"/>
+    <w:lsdException w:name="Mention" w:semiHidden="1" w:unhideWhenUsed="1"/>
+    <w:lsdException w:name="Smart Hyperlink" w:semiHidden="1" w:unhideWhenUsed="1"/>
+    <w:lsdException w:name="Hashtag" w:semiHidden="1" w:unhideWhenUsed="1"/>
+    <w:lsdException w:name="Unresolved Mention" w:semiHidden="1" w:unhideWhenUsed="1"/>
+    <w:lsdException w:name="Smart Link" w:semiHidden="1" w:unhideWhenUsed="1"/>
   </w:latentStyles>
   <w:style w:type="paragraph" w:default="1" w:styleId="a">
     <w:name w:val="Normal"/>
@@ -719,6 +1752,25 @@
       <w:ind w:left="720"/>
       <w:contextualSpacing/>
     </w:pPr>
+  </w:style>
+  <w:style w:type="table" w:styleId="a4">
+    <w:name w:val="Table Grid"/>
+    <w:basedOn w:val="a1"/>
+    <w:uiPriority w:val="39"/>
+    <w:rsid w:val="00B53C03"/>
+    <w:pPr>
+      <w:spacing w:after="0" w:line="240" w:lineRule="auto"/>
+    </w:pPr>
+    <w:tblPr>
+      <w:tblBorders>
+        <w:top w:val="single" w:sz="4" w:space="0" w:color="auto"/>
+        <w:left w:val="single" w:sz="4" w:space="0" w:color="auto"/>
+        <w:bottom w:val="single" w:sz="4" w:space="0" w:color="auto"/>
+        <w:right w:val="single" w:sz="4" w:space="0" w:color="auto"/>
+        <w:insideH w:val="single" w:sz="4" w:space="0" w:color="auto"/>
+        <w:insideV w:val="single" w:sz="4" w:space="0" w:color="auto"/>
+      </w:tblBorders>
+    </w:tblPr>
   </w:style>
 </w:styles>
 </file>

</xml_diff>